<commit_message>
Enhanced insights documentation and visualizations for H2H fantasy value analysis. Added player durability metrics and refined strategy labeling in visual outputs. Updated README to clarify data sources and visualization principles, emphasizing the relationship between projected H2H value and games played.
</commit_message>
<xml_diff>
--- a/visual_helper/quality_plots/Visualization_Insights.docx
+++ b/visual_helper/quality_plots/Visualization_Insights.docx
@@ -85,7 +85,7 @@
         <w:t xml:space="preserve">Perception: </w:t>
       </w:r>
       <w:r>
-        <w:t>Colors carry meaning through a colorblind-safe palette (blue/orange, never red+green together) and perceptually-uniform colormaps (viridis). Quantities are encoded by length/position; no pie or area charts are used, and the original stacked bar was replaced by a heatmap to avoid a moving baseline.</w:t>
+        <w:t>Quantities are encoded by length or position; no pie or area charts are used, and the category breakdown is a heatmap rather than a stacked bar to avoid a moving baseline. Heatmaps use an intuitive warm/cold diverging scheme (red = high, blue = low) and bar charts avoid pairing red with green.</w:t>
       </w:r>
     </w:p>
     <w:p>
@@ -99,7 +99,7 @@
         <w:t xml:space="preserve">Transformation: </w:t>
       </w:r>
       <w:r>
-        <w:t>Stats are standardized (z-scores) for the team-strengths heatmap and normalized to 0-1 for category comparisons so they share one scale.</w:t>
+        <w:t>Stats are standardized (z-scores) for the team-strengths heatmap and normalized for category comparisons so they share one scale.</w:t>
       </w:r>
     </w:p>
     <w:p>
@@ -113,7 +113,7 @@
         <w:t xml:space="preserve">Context: </w:t>
       </w:r>
       <w:r>
-        <w:t>Each figure has a take-away title (a conclusion, not a description), labelled axes, reference lines (y = x, ideal coverage = 0.90, the regression trend), annotated outliers, and a descriptive caption.</w:t>
+        <w:t>Each figure has a plain descriptive title (the interpretation is written here in this document, not on the chart), axis labels and tick labels that spell out the full statistic names, reference lines (y = x, ideal coverage = 0.90, the regression trend), annotated outliers, and a descriptive caption.</w:t>
       </w:r>
     </w:p>
     <w:p>
@@ -146,7 +146,7 @@
     </w:p>
     <w:p>
       <w:r>
-        <w:t>All eight visualizations map directly onto the project goal defined in the milestone: building and validating a data-driven H2H fantasy value for NBA players, and contrasting that fantasy value with real-life basketball value.</w:t>
+        <w:t>All visualizations map directly onto the project goal defined in the milestone: building and validating a data-driven H2H fantasy value for NBA players, and comparing a static pre-draft category score with simulated in-league matchup contribution.</w:t>
       </w:r>
     </w:p>
     <w:p>
@@ -173,6 +173,12 @@
       </w:r>
     </w:p>
     <w:p>
+      <w:pPr>
+        <w:rPr>
+          <w:rFonts w:hint="cs"/>
+          <w:lang w:bidi="he-IL"/>
+        </w:rPr>
+      </w:pPr>
       <w:r>
         <w:rPr>
           <w:b/>
@@ -190,25 +196,20 @@
         <w:rPr>
           <w:rFonts w:ascii="Consolas" w:hAnsi="Consolas"/>
           <w:sz w:val="18"/>
+          <w:rtl/>
+          <w:lang w:bidi="he-IL"/>
         </w:rPr>
         <w:br/>
       </w:r>
       <w:r>
         <w:rPr>
-          <w:rFonts w:ascii="Consolas" w:hAnsi="Consolas"/>
-          <w:sz w:val="18"/>
-        </w:rPr>
-        <w:br/>
-      </w:r>
-      <w:r>
-        <w:rPr>
           <w:noProof/>
         </w:rPr>
         <w:drawing>
-          <wp:inline distT="0" distB="0" distL="0" distR="0" wp14:anchorId="1E37FBF9" wp14:editId="254E5563">
-            <wp:extent cx="5486400" cy="2650490"/>
+          <wp:inline distT="0" distB="0" distL="0" distR="0" wp14:anchorId="5127CE5E" wp14:editId="16890C71">
+            <wp:extent cx="5486400" cy="3816985"/>
             <wp:effectExtent l="0" t="0" r="0" b="0"/>
-            <wp:docPr id="564381402" name="Picture 1"/>
+            <wp:docPr id="2064729604" name="Picture 1"/>
             <wp:cNvGraphicFramePr>
               <a:graphicFrameLocks xmlns:a="http://schemas.openxmlformats.org/drawingml/2006/main" noChangeAspect="1"/>
             </wp:cNvGraphicFramePr>
@@ -237,7 +238,7 @@
                   <pic:spPr bwMode="auto">
                     <a:xfrm>
                       <a:off x="0" y="0"/>
-                      <a:ext cx="5486400" cy="2650490"/>
+                      <a:ext cx="5486400" cy="3816985"/>
                     </a:xfrm>
                     <a:prstGeom prst="rect">
                       <a:avLst/>
@@ -303,6 +304,12 @@
       </w:r>
     </w:p>
     <w:p>
+      <w:pPr>
+        <w:rPr>
+          <w:rFonts w:hint="cs"/>
+          <w:lang w:bidi="he-IL"/>
+        </w:rPr>
+      </w:pPr>
       <w:r>
         <w:rPr>
           <w:b/>
@@ -320,6 +327,8 @@
         <w:rPr>
           <w:rFonts w:ascii="Consolas" w:hAnsi="Consolas"/>
           <w:sz w:val="18"/>
+          <w:rtl/>
+          <w:lang w:bidi="he-IL"/>
         </w:rPr>
         <w:br/>
       </w:r>
@@ -328,10 +337,10 @@
           <w:noProof/>
         </w:rPr>
         <w:drawing>
-          <wp:inline distT="0" distB="0" distL="0" distR="0" wp14:anchorId="747044B1" wp14:editId="26F6F00E">
+          <wp:inline distT="0" distB="0" distL="0" distR="0" wp14:anchorId="35EFA6B4" wp14:editId="14BEE38F">
             <wp:extent cx="5486400" cy="3816985"/>
             <wp:effectExtent l="0" t="0" r="0" b="0"/>
-            <wp:docPr id="2126438037" name="Picture 2"/>
+            <wp:docPr id="1050091516" name="Picture 3"/>
             <wp:cNvGraphicFramePr>
               <a:graphicFrameLocks xmlns:a="http://schemas.openxmlformats.org/drawingml/2006/main" noChangeAspect="1"/>
             </wp:cNvGraphicFramePr>
@@ -339,7 +348,7 @@
               <a:graphicData uri="http://schemas.openxmlformats.org/drawingml/2006/picture">
                 <pic:pic xmlns:pic="http://schemas.openxmlformats.org/drawingml/2006/picture">
                   <pic:nvPicPr>
-                    <pic:cNvPr id="0" name="Picture 3"/>
+                    <pic:cNvPr id="0" name="Picture 5"/>
                     <pic:cNvPicPr>
                       <a:picLocks noChangeAspect="1" noChangeArrowheads="1"/>
                     </pic:cNvPicPr>
@@ -426,6 +435,12 @@
       </w:r>
     </w:p>
     <w:p>
+      <w:pPr>
+        <w:rPr>
+          <w:rFonts w:hint="cs"/>
+          <w:lang w:bidi="he-IL"/>
+        </w:rPr>
+      </w:pPr>
       <w:r>
         <w:rPr>
           <w:b/>
@@ -443,6 +458,8 @@
         <w:rPr>
           <w:rFonts w:ascii="Consolas" w:hAnsi="Consolas"/>
           <w:sz w:val="18"/>
+          <w:rtl/>
+          <w:lang w:bidi="he-IL"/>
         </w:rPr>
         <w:br/>
       </w:r>
@@ -451,10 +468,10 @@
           <w:noProof/>
         </w:rPr>
         <w:drawing>
-          <wp:inline distT="0" distB="0" distL="0" distR="0" wp14:anchorId="42CC8571" wp14:editId="4A7C1239">
-            <wp:extent cx="5486400" cy="3616325"/>
-            <wp:effectExtent l="0" t="0" r="0" b="3175"/>
-            <wp:docPr id="820334623" name="Picture 3"/>
+          <wp:inline distT="0" distB="0" distL="0" distR="0" wp14:anchorId="37B3612E" wp14:editId="2D04A718">
+            <wp:extent cx="5486400" cy="3924300"/>
+            <wp:effectExtent l="0" t="0" r="0" b="0"/>
+            <wp:docPr id="385101615" name="Picture 2"/>
             <wp:cNvGraphicFramePr>
               <a:graphicFrameLocks xmlns:a="http://schemas.openxmlformats.org/drawingml/2006/main" noChangeAspect="1"/>
             </wp:cNvGraphicFramePr>
@@ -462,7 +479,7 @@
               <a:graphicData uri="http://schemas.openxmlformats.org/drawingml/2006/picture">
                 <pic:pic xmlns:pic="http://schemas.openxmlformats.org/drawingml/2006/picture">
                   <pic:nvPicPr>
-                    <pic:cNvPr id="0" name="Picture 5"/>
+                    <pic:cNvPr id="0" name="Picture 3"/>
                     <pic:cNvPicPr>
                       <a:picLocks noChangeAspect="1" noChangeArrowheads="1"/>
                     </pic:cNvPicPr>
@@ -483,7 +500,7 @@
                   <pic:spPr bwMode="auto">
                     <a:xfrm>
                       <a:off x="0" y="0"/>
-                      <a:ext cx="5486400" cy="3616325"/>
+                      <a:ext cx="5486400" cy="3924300"/>
                     </a:xfrm>
                     <a:prstGeom prst="rect">
                       <a:avLst/>
@@ -560,6 +577,12 @@
       </w:r>
     </w:p>
     <w:p>
+      <w:pPr>
+        <w:rPr>
+          <w:rFonts w:hint="cs"/>
+          <w:lang w:bidi="he-IL"/>
+        </w:rPr>
+      </w:pPr>
       <w:r>
         <w:rPr>
           <w:b/>
@@ -577,6 +600,8 @@
         <w:rPr>
           <w:rFonts w:ascii="Consolas" w:hAnsi="Consolas"/>
           <w:sz w:val="18"/>
+          <w:rtl/>
+          <w:lang w:bidi="he-IL"/>
         </w:rPr>
         <w:br/>
       </w:r>
@@ -585,10 +610,10 @@
           <w:noProof/>
         </w:rPr>
         <w:drawing>
-          <wp:inline distT="0" distB="0" distL="0" distR="0" wp14:anchorId="3B495B44" wp14:editId="328EAC47">
-            <wp:extent cx="5486400" cy="4401185"/>
+          <wp:inline distT="0" distB="0" distL="0" distR="0" wp14:anchorId="1112BFC7" wp14:editId="4DD5C89F">
+            <wp:extent cx="5486400" cy="3714750"/>
             <wp:effectExtent l="0" t="0" r="0" b="0"/>
-            <wp:docPr id="1401941975" name="Picture 4"/>
+            <wp:docPr id="1779248741" name="Picture 4"/>
             <wp:cNvGraphicFramePr>
               <a:graphicFrameLocks xmlns:a="http://schemas.openxmlformats.org/drawingml/2006/main" noChangeAspect="1"/>
             </wp:cNvGraphicFramePr>
@@ -617,7 +642,7 @@
                   <pic:spPr bwMode="auto">
                     <a:xfrm>
                       <a:off x="0" y="0"/>
-                      <a:ext cx="5486400" cy="4401185"/>
+                      <a:ext cx="5486400" cy="3714750"/>
                     </a:xfrm>
                     <a:prstGeom prst="rect">
                       <a:avLst/>
@@ -683,6 +708,12 @@
       </w:r>
     </w:p>
     <w:p>
+      <w:pPr>
+        <w:rPr>
+          <w:rFonts w:hint="cs"/>
+          <w:lang w:bidi="he-IL"/>
+        </w:rPr>
+      </w:pPr>
       <w:r>
         <w:rPr>
           <w:b/>
@@ -700,6 +731,8 @@
         <w:rPr>
           <w:rFonts w:ascii="Consolas" w:hAnsi="Consolas"/>
           <w:sz w:val="18"/>
+          <w:rtl/>
+          <w:lang w:bidi="he-IL"/>
         </w:rPr>
         <w:br/>
       </w:r>
@@ -708,10 +741,10 @@
           <w:noProof/>
         </w:rPr>
         <w:drawing>
-          <wp:inline distT="0" distB="0" distL="0" distR="0" wp14:anchorId="2356EF63" wp14:editId="15F1B914">
-            <wp:extent cx="5486400" cy="3451225"/>
-            <wp:effectExtent l="0" t="0" r="0" b="0"/>
-            <wp:docPr id="1752780211" name="Picture 5"/>
+          <wp:inline distT="0" distB="0" distL="0" distR="0" wp14:anchorId="532748F7" wp14:editId="720C56A9">
+            <wp:extent cx="5486400" cy="3441700"/>
+            <wp:effectExtent l="0" t="0" r="0" b="6350"/>
+            <wp:docPr id="363493389" name="Picture 5"/>
             <wp:cNvGraphicFramePr>
               <a:graphicFrameLocks xmlns:a="http://schemas.openxmlformats.org/drawingml/2006/main" noChangeAspect="1"/>
             </wp:cNvGraphicFramePr>
@@ -740,7 +773,7 @@
                   <pic:spPr bwMode="auto">
                     <a:xfrm>
                       <a:off x="0" y="0"/>
-                      <a:ext cx="5486400" cy="3451225"/>
+                      <a:ext cx="5486400" cy="3441700"/>
                     </a:xfrm>
                     <a:prstGeom prst="rect">
                       <a:avLst/>
@@ -806,6 +839,12 @@
       </w:r>
     </w:p>
     <w:p>
+      <w:pPr>
+        <w:rPr>
+          <w:rFonts w:hint="cs"/>
+          <w:lang w:bidi="he-IL"/>
+        </w:rPr>
+      </w:pPr>
       <w:r>
         <w:rPr>
           <w:b/>
@@ -823,6 +862,8 @@
         <w:rPr>
           <w:rFonts w:ascii="Consolas" w:hAnsi="Consolas"/>
           <w:sz w:val="18"/>
+          <w:rtl/>
+          <w:lang w:bidi="he-IL"/>
         </w:rPr>
         <w:br/>
       </w:r>
@@ -831,10 +872,10 @@
           <w:noProof/>
         </w:rPr>
         <w:drawing>
-          <wp:inline distT="0" distB="0" distL="0" distR="0" wp14:anchorId="491B54B6" wp14:editId="43CB79C7">
-            <wp:extent cx="5486400" cy="3768090"/>
-            <wp:effectExtent l="0" t="0" r="0" b="3810"/>
-            <wp:docPr id="925051967" name="Picture 6"/>
+          <wp:inline distT="0" distB="0" distL="0" distR="0" wp14:anchorId="30DEFFFA" wp14:editId="4622462A">
+            <wp:extent cx="5486400" cy="5034280"/>
+            <wp:effectExtent l="0" t="0" r="0" b="0"/>
+            <wp:docPr id="565112523" name="Picture 6"/>
             <wp:cNvGraphicFramePr>
               <a:graphicFrameLocks xmlns:a="http://schemas.openxmlformats.org/drawingml/2006/main" noChangeAspect="1"/>
             </wp:cNvGraphicFramePr>
@@ -863,7 +904,7 @@
                   <pic:spPr bwMode="auto">
                     <a:xfrm>
                       <a:off x="0" y="0"/>
-                      <a:ext cx="5486400" cy="3768090"/>
+                      <a:ext cx="5486400" cy="5034280"/>
                     </a:xfrm>
                     <a:prstGeom prst="rect">
                       <a:avLst/>
@@ -929,6 +970,12 @@
       </w:r>
     </w:p>
     <w:p>
+      <w:pPr>
+        <w:rPr>
+          <w:rFonts w:hint="cs"/>
+          <w:lang w:bidi="he-IL"/>
+        </w:rPr>
+      </w:pPr>
       <w:r>
         <w:rPr>
           <w:b/>
@@ -946,6 +993,8 @@
         <w:rPr>
           <w:rFonts w:ascii="Consolas" w:hAnsi="Consolas"/>
           <w:sz w:val="18"/>
+          <w:rtl/>
+          <w:lang w:bidi="he-IL"/>
         </w:rPr>
         <w:br/>
       </w:r>
@@ -954,10 +1003,10 @@
           <w:noProof/>
         </w:rPr>
         <w:drawing>
-          <wp:inline distT="0" distB="0" distL="0" distR="0" wp14:anchorId="7D482FAC" wp14:editId="7244CF42">
-            <wp:extent cx="5486400" cy="6040120"/>
+          <wp:inline distT="0" distB="0" distL="0" distR="0" wp14:anchorId="23A5751C" wp14:editId="426BC974">
+            <wp:extent cx="5486400" cy="5621655"/>
             <wp:effectExtent l="0" t="0" r="0" b="0"/>
-            <wp:docPr id="51857316" name="Picture 7"/>
+            <wp:docPr id="1634376576" name="Picture 7"/>
             <wp:cNvGraphicFramePr>
               <a:graphicFrameLocks xmlns:a="http://schemas.openxmlformats.org/drawingml/2006/main" noChangeAspect="1"/>
             </wp:cNvGraphicFramePr>
@@ -986,7 +1035,7 @@
                   <pic:spPr bwMode="auto">
                     <a:xfrm>
                       <a:off x="0" y="0"/>
-                      <a:ext cx="5486400" cy="6040120"/>
+                      <a:ext cx="5486400" cy="5621655"/>
                     </a:xfrm>
                     <a:prstGeom prst="rect">
                       <a:avLst/>
@@ -1011,7 +1060,7 @@
         <w:t xml:space="preserve">What it shows: </w:t>
       </w:r>
       <w:r>
-        <w:t>A ranked horizontal bar chart of the 30 highest projected H2H values.</w:t>
+        <w:t>A ranked horizontal bar chart of the 30 highest projected H2H values, with projected games played (out of 82) shown in parentheses next to each bar.</w:t>
       </w:r>
     </w:p>
     <w:p>
@@ -1022,7 +1071,7 @@
         <w:t xml:space="preserve">Insight to mention in the paper: </w:t>
       </w:r>
       <w:r>
-        <w:t>The model's top tier is led by jokicni01 (6.18), gilgesh01 (6.12) and duranke01 (5.96); the whole top 30 is compressed into a narrow band (4.97-6.18). The small gaps between adjacent players show that draft order matters most at the very top and that many mid-first-round players are near-interchangeable in value.</w:t>
+        <w:t>The model's top tier is led by bridgmi01 (5.49), gilgesh01 (5.30) and jokicni01 (5.20); the whole top 30 is compressed into a narrow band (4.06-5.49). Projected games played ranges from about 11 to 80 across the pool, so two players with similar H2H value can still differ in durability.</w:t>
       </w:r>
     </w:p>
     <w:p>
@@ -1037,18 +1086,6 @@
           <w:i/>
         </w:rPr>
         <w:t>Scale (zero baseline, sorted), Perception (length encoding), Context.</w:t>
-      </w:r>
-    </w:p>
-    <w:p>
-      <w:pPr>
-        <w:pStyle w:val="Heading1"/>
-      </w:pPr>
-      <w:r>
-        <w:rPr>
-          <w:color w:val="0B5394"/>
-        </w:rPr>
-        <w:lastRenderedPageBreak/>
-        <w:t>3. Real value vs fantasy value (core thesis)</w:t>
       </w:r>
     </w:p>
     <w:p>
@@ -1059,10 +1096,17 @@
         <w:rPr>
           <w:color w:val="0B5394"/>
         </w:rPr>
-        <w:t>3.1 Win Shares vs H2H value</w:t>
+        <w:lastRenderedPageBreak/>
+        <w:t>2.5 H2H value versus games played</w:t>
       </w:r>
     </w:p>
     <w:p>
+      <w:pPr>
+        <w:rPr>
+          <w:rFonts w:hint="cs"/>
+          <w:lang w:bidi="he-IL"/>
+        </w:rPr>
+      </w:pPr>
       <w:r>
         <w:rPr>
           <w:b/>
@@ -1074,12 +1118,14 @@
           <w:rFonts w:ascii="Consolas" w:hAnsi="Consolas"/>
           <w:sz w:val="18"/>
         </w:rPr>
-        <w:t>thesis/ws_vs_h2h_scatter.png</w:t>
+        <w:t>value/h2h_value_vs_games_played.png</w:t>
       </w:r>
       <w:r>
         <w:rPr>
           <w:rFonts w:ascii="Consolas" w:hAnsi="Consolas"/>
           <w:sz w:val="18"/>
+          <w:rtl/>
+          <w:lang w:bidi="he-IL"/>
         </w:rPr>
         <w:br/>
       </w:r>
@@ -1088,10 +1134,10 @@
           <w:noProof/>
         </w:rPr>
         <w:drawing>
-          <wp:inline distT="0" distB="0" distL="0" distR="0" wp14:anchorId="69831C7F" wp14:editId="5A910F86">
-            <wp:extent cx="5486400" cy="4279265"/>
-            <wp:effectExtent l="0" t="0" r="0" b="6985"/>
-            <wp:docPr id="623134987" name="Picture 8"/>
+          <wp:inline distT="0" distB="0" distL="0" distR="0" wp14:anchorId="6A1EB15C" wp14:editId="51E9AFFB">
+            <wp:extent cx="5041900" cy="3555409"/>
+            <wp:effectExtent l="0" t="0" r="6350" b="6985"/>
+            <wp:docPr id="305954368" name="Picture 8"/>
             <wp:cNvGraphicFramePr>
               <a:graphicFrameLocks xmlns:a="http://schemas.openxmlformats.org/drawingml/2006/main" noChangeAspect="1"/>
             </wp:cNvGraphicFramePr>
@@ -1104,7 +1150,7 @@
                       <a:picLocks noChangeAspect="1" noChangeArrowheads="1"/>
                     </pic:cNvPicPr>
                   </pic:nvPicPr>
-                  <pic:blipFill>
+                  <pic:blipFill rotWithShape="1">
                     <a:blip r:embed="rId13">
                       <a:extLst>
                         <a:ext uri="{28A0092B-C50C-407E-A947-70E740481C1C}">
@@ -1112,7 +1158,7 @@
                         </a:ext>
                       </a:extLst>
                     </a:blip>
-                    <a:srcRect/>
+                    <a:srcRect l="16319" r="16550" b="4260"/>
                     <a:stretch>
                       <a:fillRect/>
                     </a:stretch>
@@ -1120,7 +1166,7 @@
                   <pic:spPr bwMode="auto">
                     <a:xfrm>
                       <a:off x="0" y="0"/>
-                      <a:ext cx="5486400" cy="4279265"/>
+                      <a:ext cx="5049727" cy="3560928"/>
                     </a:xfrm>
                     <a:prstGeom prst="rect">
                       <a:avLst/>
@@ -1129,6 +1175,11 @@
                     <a:ln>
                       <a:noFill/>
                     </a:ln>
+                    <a:extLst>
+                      <a:ext uri="{53640926-AAD7-44D8-BBD7-CCE9431645EC}">
+                        <a14:shadowObscured xmlns:a14="http://schemas.microsoft.com/office/drawing/2010/main"/>
+                      </a:ext>
+                    </a:extLst>
                   </pic:spPr>
                 </pic:pic>
               </a:graphicData>
@@ -1145,7 +1196,7 @@
         <w:t xml:space="preserve">What it shows: </w:t>
       </w:r>
       <w:r>
-        <w:t>A scatter plot of each player's real-life value (Win Shares) against fantasy value (H2H), with a regression line and labelled outliers.</w:t>
+        <w:t>A scatter of each player's projected H2H value against their projected games played (out of 82), with a reference line at a full 82-game season.</w:t>
       </w:r>
     </w:p>
     <w:p>
@@ -1156,7 +1207,7 @@
         <w:t xml:space="preserve">Insight to mention in the paper: </w:t>
       </w:r>
       <w:r>
-        <w:t>Real and fantasy value are only moderately related (Pearson r = 0.56, r-squared = 0.32, n = 132): real-life value explains only about 32% of the variation in fantasy value. This is the central evidence for the project's premise that a player's fantasy worth does not match his basketball worth, and the labelled outliers are concrete examples to discuss.</w:t>
+        <w:t>H2H value is computed from projected weekly stats in `sim_stats/projected_2027_weekly.csv` (Monte Carlo simulation over 500 seasons). Those weekly totals already embed missed games via each player's durability, but games played is not multiplied again on top (availability_multiplier = 1.0 for all players in `h2h_value_2027.csv`). The correlation between H2H value and games played is only r = 0.73, meaning per-week talent and availability are related but not the same: e.g. bridgmi01 ranks highly on value (5.49) but is projected for only about 80 games - an important draft risk to flag separately.</w:t>
       </w:r>
     </w:p>
     <w:p>
@@ -1170,7 +1221,40 @@
         <w:rPr>
           <w:i/>
         </w:rPr>
-        <w:t>Context (take-away title, trend line, outlier labels), Transformation (regression fit).</w:t>
+        <w:t>Context (reference line at 82 games, trend line, labelled outliers), Transformation.</w:t>
+      </w:r>
+    </w:p>
+    <w:p>
+      <w:pPr>
+        <w:pStyle w:val="Heading1"/>
+      </w:pPr>
+      <w:r>
+        <w:rPr>
+          <w:color w:val="0B5394"/>
+        </w:rPr>
+        <w:t>3. Pre-draft H2H value vs simulated in-league win shares</w:t>
+      </w:r>
+    </w:p>
+    <w:p>
+      <w:r>
+        <w:t>This section compares two fantasy-centric measures, both derived from the same Monte Carlo projections (sim_stats/projected_2027_weekly.csv) — neither reflects actual NBA team success:</w:t>
+      </w:r>
+    </w:p>
+    <w:p>
+      <w:pPr>
+        <w:pStyle w:val="ListBullet"/>
+      </w:pPr>
+      <w:r>
+        <w:t>H2H value (draft/compute_h2h_value_simple.py): a static pre-draft score. Each player's projected weekly stats are converted to percentile ranks across the nine H2H categories, summed, and adjusted for projection risk. Computed for the full player pool (~680 players).</w:t>
+      </w:r>
+    </w:p>
+    <w:p>
+      <w:pPr>
+        <w:pStyle w:val="ListBullet"/>
+      </w:pPr>
+      <w:r>
+        <w:lastRenderedPageBreak/>
+        <w:t>Simulated win shares (draft/compute_win_shares.py): in-league impact from a Monte Carlo fantasy season. After a 12-team snake draft, each weekly H2H matchup samples stats from the projected distributions; win shares for a player equal how many extra matchup wins their team gains versus swapping them for a replacement-level undrafted player. Computed only for drafted players (~132) in one draft run.</w:t>
       </w:r>
     </w:p>
     <w:p>
@@ -1181,11 +1265,16 @@
         <w:rPr>
           <w:color w:val="0B5394"/>
         </w:rPr>
-        <w:lastRenderedPageBreak/>
-        <w:t>3.2 Most over- and under-valued players</w:t>
+        <w:t>3.1 Pre-draft H2H value vs simulated win shares</w:t>
       </w:r>
     </w:p>
     <w:p>
+      <w:pPr>
+        <w:rPr>
+          <w:rFonts w:hint="cs"/>
+          <w:lang w:bidi="he-IL"/>
+        </w:rPr>
+      </w:pPr>
       <w:r>
         <w:rPr>
           <w:b/>
@@ -1197,12 +1286,14 @@
           <w:rFonts w:ascii="Consolas" w:hAnsi="Consolas"/>
           <w:sz w:val="18"/>
         </w:rPr>
-        <w:t>thesis/over_under_valued.png</w:t>
+        <w:t>thesis/ws_vs_h2h_scatter.png</w:t>
       </w:r>
       <w:r>
         <w:rPr>
           <w:rFonts w:ascii="Consolas" w:hAnsi="Consolas"/>
           <w:sz w:val="18"/>
+          <w:rtl/>
+          <w:lang w:bidi="he-IL"/>
         </w:rPr>
         <w:br/>
       </w:r>
@@ -1211,10 +1302,10 @@
           <w:noProof/>
         </w:rPr>
         <w:drawing>
-          <wp:inline distT="0" distB="0" distL="0" distR="0" wp14:anchorId="5C58F2A1" wp14:editId="375B5AEB">
-            <wp:extent cx="5486400" cy="4662805"/>
-            <wp:effectExtent l="0" t="0" r="0" b="4445"/>
-            <wp:docPr id="1787568335" name="Picture 9"/>
+          <wp:inline distT="0" distB="0" distL="0" distR="0" wp14:anchorId="384391FF" wp14:editId="0D8C4523">
+            <wp:extent cx="5303520" cy="3761828"/>
+            <wp:effectExtent l="0" t="0" r="0" b="0"/>
+            <wp:docPr id="1901933799" name="Picture 9"/>
             <wp:cNvGraphicFramePr>
               <a:graphicFrameLocks xmlns:a="http://schemas.openxmlformats.org/drawingml/2006/main" noChangeAspect="1"/>
             </wp:cNvGraphicFramePr>
@@ -1227,7 +1318,7 @@
                       <a:picLocks noChangeAspect="1" noChangeArrowheads="1"/>
                     </pic:cNvPicPr>
                   </pic:nvPicPr>
-                  <pic:blipFill>
+                  <pic:blipFill rotWithShape="1">
                     <a:blip r:embed="rId14">
                       <a:extLst>
                         <a:ext uri="{28A0092B-C50C-407E-A947-70E740481C1C}">
@@ -1235,7 +1326,7 @@
                         </a:ext>
                       </a:extLst>
                     </a:blip>
-                    <a:srcRect/>
+                    <a:srcRect l="25872" r="27321" b="3872"/>
                     <a:stretch>
                       <a:fillRect/>
                     </a:stretch>
@@ -1243,7 +1334,7 @@
                   <pic:spPr bwMode="auto">
                     <a:xfrm>
                       <a:off x="0" y="0"/>
-                      <a:ext cx="5486400" cy="4662805"/>
+                      <a:ext cx="5317256" cy="3771571"/>
                     </a:xfrm>
                     <a:prstGeom prst="rect">
                       <a:avLst/>
@@ -1252,6 +1343,11 @@
                     <a:ln>
                       <a:noFill/>
                     </a:ln>
+                    <a:extLst>
+                      <a:ext uri="{53640926-AAD7-44D8-BBD7-CCE9431645EC}">
+                        <a14:shadowObscured xmlns:a14="http://schemas.microsoft.com/office/drawing/2010/main"/>
+                      </a:ext>
+                    </a:extLst>
                   </pic:spPr>
                 </pic:pic>
               </a:graphicData>
@@ -1268,7 +1364,7 @@
         <w:t xml:space="preserve">What it shows: </w:t>
       </w:r>
       <w:r>
-        <w:t>A diverging bar chart of the players with the largest gap between their Win-Shares rank and their H2H rank.</w:t>
+        <w:t>A scatter plot of each drafted player's simulated win shares (x-axis) against their pre-draft H2H value (y-axis), with a regression line and labelled outliers.</w:t>
       </w:r>
     </w:p>
     <w:p>
@@ -1279,7 +1375,7 @@
         <w:t xml:space="preserve">Insight to mention in the paper: </w:t>
       </w:r>
       <w:r>
-        <w:t>Some players are fantasy overvalued while others are hidden bargains: duranke01 is ranked about 93 places higher in fantasy than in real life, while clingdo01 is about 98 places higher in real life than in fantasy. These gaps are actionable draft advice and a vivid illustration of the thesis from 3.1.</w:t>
+        <w:t>The two measures are only moderately related (Pearson r = 0.56, r-squared = 0.32, n = 132 drafted players): simulated matchup contribution explains only about 32% of the variation in the pre-draft category score. This shows that a strong pre-draft ranking does not always translate into the same in-league impact once rosters, weekly variance, and replacement value are accounted for. Labelled outliers are concrete examples to discuss.</w:t>
       </w:r>
     </w:p>
     <w:p>
@@ -1293,19 +1389,7 @@
         <w:rPr>
           <w:i/>
         </w:rPr>
-        <w:t>Perception (colorblind-safe blue/orange diverging), Scale (signed zero baseline), Context.</w:t>
-      </w:r>
-    </w:p>
-    <w:p>
-      <w:pPr>
-        <w:pStyle w:val="Heading1"/>
-      </w:pPr>
-      <w:r>
-        <w:rPr>
-          <w:color w:val="0B5394"/>
-        </w:rPr>
-        <w:lastRenderedPageBreak/>
-        <w:t>4. Projection model evaluation</w:t>
+        <w:t>Context (descriptive title, trend line, outlier labels), Transformation (regression fit).</w:t>
       </w:r>
     </w:p>
     <w:p>
@@ -1316,10 +1400,17 @@
         <w:rPr>
           <w:color w:val="0B5394"/>
         </w:rPr>
-        <w:t>4.1 Predicted vs actual (per stat)</w:t>
+        <w:lastRenderedPageBreak/>
+        <w:t>3.2 Largest rank gaps between the two measures</w:t>
       </w:r>
     </w:p>
     <w:p>
+      <w:pPr>
+        <w:rPr>
+          <w:rFonts w:hint="cs"/>
+          <w:lang w:bidi="he-IL"/>
+        </w:rPr>
+      </w:pPr>
       <w:r>
         <w:rPr>
           <w:b/>
@@ -1331,12 +1422,14 @@
           <w:rFonts w:ascii="Consolas" w:hAnsi="Consolas"/>
           <w:sz w:val="18"/>
         </w:rPr>
-        <w:t>model/predicted_vs_actual.png</w:t>
+        <w:t>thesis/over_under_valued.png</w:t>
       </w:r>
       <w:r>
         <w:rPr>
           <w:rFonts w:ascii="Consolas" w:hAnsi="Consolas"/>
           <w:sz w:val="18"/>
+          <w:rtl/>
+          <w:lang w:bidi="he-IL"/>
         </w:rPr>
         <w:br/>
       </w:r>
@@ -1345,10 +1438,10 @@
           <w:noProof/>
         </w:rPr>
         <w:drawing>
-          <wp:inline distT="0" distB="0" distL="0" distR="0" wp14:anchorId="74149767" wp14:editId="28D361E8">
-            <wp:extent cx="5486400" cy="5333365"/>
-            <wp:effectExtent l="0" t="0" r="0" b="635"/>
-            <wp:docPr id="306784740" name="Picture 10"/>
+          <wp:inline distT="0" distB="0" distL="0" distR="0" wp14:anchorId="456FF80C" wp14:editId="5C57C4A6">
+            <wp:extent cx="5486400" cy="3634105"/>
+            <wp:effectExtent l="0" t="0" r="0" b="4445"/>
+            <wp:docPr id="132377215" name="Picture 10"/>
             <wp:cNvGraphicFramePr>
               <a:graphicFrameLocks xmlns:a="http://schemas.openxmlformats.org/drawingml/2006/main" noChangeAspect="1"/>
             </wp:cNvGraphicFramePr>
@@ -1377,7 +1470,7 @@
                   <pic:spPr bwMode="auto">
                     <a:xfrm>
                       <a:off x="0" y="0"/>
-                      <a:ext cx="5486400" cy="5333365"/>
+                      <a:ext cx="5486400" cy="3634105"/>
                     </a:xfrm>
                     <a:prstGeom prst="rect">
                       <a:avLst/>
@@ -1402,7 +1495,7 @@
         <w:t xml:space="preserve">What it shows: </w:t>
       </w:r>
       <w:r>
-        <w:t>A 3x3 grid of predicted-vs-actual scatter plots for the nine projected statistics, each with a y = x reference line.</w:t>
+        <w:t>A diverging bar chart of drafted players with the largest gap between their simulated win-shares rank and their pre-draft H2H rank (rank difference = win-shares rank − H2H rank).</w:t>
       </w:r>
     </w:p>
     <w:p>
@@ -1413,7 +1506,7 @@
         <w:t xml:space="preserve">Insight to mention in the paper: </w:t>
       </w:r>
       <w:r>
-        <w:t>Projections cluster tightly around the diagonal for volume/counting stats (best: PTS, r = 0.75) but scatter widely for shooting percentages (worst: FT%, r = 0.37). This tells the reader exactly which projected quantities can be trusted and which carry large uncertainty.</w:t>
+        <w:t>Some players look much better on paper than in the simulated league, and vice versa: duranke01 is ranked about 93 places higher pre-draft (H2H) than in the simulation (win shares), while clingdo01 is about 98 places higher in the simulation than pre-draft. These gaps highlight players whose category profile does not convert cleanly into weekly matchup wins — useful context for draft strategy beyond the static H2H ranking.</w:t>
       </w:r>
     </w:p>
     <w:p>
@@ -1427,7 +1520,19 @@
         <w:rPr>
           <w:i/>
         </w:rPr>
-        <w:t>Conditioning (one panel per stat), Context (y = x reference, per-panel correlation).</w:t>
+        <w:t>Perception (colorblind-safe blue/orange diverging), Scale (signed zero baseline), Context.</w:t>
+      </w:r>
+    </w:p>
+    <w:p>
+      <w:pPr>
+        <w:pStyle w:val="Heading1"/>
+      </w:pPr>
+      <w:r>
+        <w:rPr>
+          <w:color w:val="0B5394"/>
+        </w:rPr>
+        <w:lastRenderedPageBreak/>
+        <w:t>4. Projection model evaluation</w:t>
       </w:r>
     </w:p>
     <w:p>
@@ -1438,11 +1543,16 @@
         <w:rPr>
           <w:color w:val="0B5394"/>
         </w:rPr>
-        <w:lastRenderedPageBreak/>
-        <w:t>4.2 Projection error per stat (MAE / RMSE)</w:t>
+        <w:t>4.1 Predicted vs actual (per stat)</w:t>
       </w:r>
     </w:p>
     <w:p>
+      <w:pPr>
+        <w:rPr>
+          <w:rFonts w:hint="cs"/>
+          <w:lang w:bidi="he-IL"/>
+        </w:rPr>
+      </w:pPr>
       <w:r>
         <w:rPr>
           <w:b/>
@@ -1454,12 +1564,14 @@
           <w:rFonts w:ascii="Consolas" w:hAnsi="Consolas"/>
           <w:sz w:val="18"/>
         </w:rPr>
-        <w:t>model/error_mae_rmse.png</w:t>
+        <w:t>model/predicted_vs_actual.png</w:t>
       </w:r>
       <w:r>
         <w:rPr>
           <w:rFonts w:ascii="Consolas" w:hAnsi="Consolas"/>
           <w:sz w:val="18"/>
+          <w:rtl/>
+          <w:lang w:bidi="he-IL"/>
         </w:rPr>
         <w:br/>
       </w:r>
@@ -1468,10 +1580,10 @@
           <w:noProof/>
         </w:rPr>
         <w:drawing>
-          <wp:inline distT="0" distB="0" distL="0" distR="0" wp14:anchorId="2308946B" wp14:editId="060594BF">
-            <wp:extent cx="5486400" cy="3149600"/>
-            <wp:effectExtent l="0" t="0" r="0" b="0"/>
-            <wp:docPr id="645530972" name="Picture 11"/>
+          <wp:inline distT="0" distB="0" distL="0" distR="0" wp14:anchorId="5294CF41" wp14:editId="6666F4C3">
+            <wp:extent cx="5486400" cy="5332730"/>
+            <wp:effectExtent l="0" t="0" r="0" b="1270"/>
+            <wp:docPr id="1824238340" name="Picture 11"/>
             <wp:cNvGraphicFramePr>
               <a:graphicFrameLocks xmlns:a="http://schemas.openxmlformats.org/drawingml/2006/main" noChangeAspect="1"/>
             </wp:cNvGraphicFramePr>
@@ -1486,6 +1598,399 @@
                   </pic:nvPicPr>
                   <pic:blipFill>
                     <a:blip r:embed="rId16">
+                      <a:extLst>
+                        <a:ext uri="{28A0092B-C50C-407E-A947-70E740481C1C}">
+                          <a14:useLocalDpi xmlns:a14="http://schemas.microsoft.com/office/drawing/2010/main" val="0"/>
+                        </a:ext>
+                      </a:extLst>
+                    </a:blip>
+                    <a:srcRect/>
+                    <a:stretch>
+                      <a:fillRect/>
+                    </a:stretch>
+                  </pic:blipFill>
+                  <pic:spPr bwMode="auto">
+                    <a:xfrm>
+                      <a:off x="0" y="0"/>
+                      <a:ext cx="5486400" cy="5332730"/>
+                    </a:xfrm>
+                    <a:prstGeom prst="rect">
+                      <a:avLst/>
+                    </a:prstGeom>
+                    <a:noFill/>
+                    <a:ln>
+                      <a:noFill/>
+                    </a:ln>
+                  </pic:spPr>
+                </pic:pic>
+              </a:graphicData>
+            </a:graphic>
+          </wp:inline>
+        </w:drawing>
+      </w:r>
+    </w:p>
+    <w:p>
+      <w:r>
+        <w:rPr>
+          <w:b/>
+        </w:rPr>
+        <w:t xml:space="preserve">What it shows: </w:t>
+      </w:r>
+      <w:r>
+        <w:t>A 3x3 grid of predicted-vs-actual scatter plots for the nine projected statistics, each with a y = x reference line.</w:t>
+      </w:r>
+    </w:p>
+    <w:p>
+      <w:r>
+        <w:rPr>
+          <w:b/>
+        </w:rPr>
+        <w:t xml:space="preserve">Insight to mention in the paper: </w:t>
+      </w:r>
+      <w:r>
+        <w:t>Projections cluster tightly around the diagonal for volume/counting stats (best: PTS, r = 0.75) but scatter widely for shooting percentages (worst: FT%, r = 0.37). This tells the reader exactly which projected quantities can be trusted and which carry large uncertainty.</w:t>
+      </w:r>
+    </w:p>
+    <w:p>
+      <w:r>
+        <w:rPr>
+          <w:b/>
+        </w:rPr>
+        <w:t xml:space="preserve">Principles demonstrated: </w:t>
+      </w:r>
+      <w:r>
+        <w:rPr>
+          <w:i/>
+        </w:rPr>
+        <w:t>Conditioning (one panel per stat), Context (y = x reference, per-panel correlation).</w:t>
+      </w:r>
+    </w:p>
+    <w:p>
+      <w:pPr>
+        <w:pStyle w:val="Heading3"/>
+      </w:pPr>
+      <w:r>
+        <w:rPr>
+          <w:color w:val="0B5394"/>
+        </w:rPr>
+        <w:lastRenderedPageBreak/>
+        <w:t>4.2 Projection error per stat (MAE / RMSE)</w:t>
+      </w:r>
+    </w:p>
+    <w:p>
+      <w:pPr>
+        <w:rPr>
+          <w:rFonts w:hint="cs"/>
+          <w:lang w:bidi="he-IL"/>
+        </w:rPr>
+      </w:pPr>
+      <w:r>
+        <w:rPr>
+          <w:b/>
+        </w:rPr>
+        <w:t xml:space="preserve">File: </w:t>
+      </w:r>
+      <w:r>
+        <w:rPr>
+          <w:rFonts w:ascii="Consolas" w:hAnsi="Consolas"/>
+          <w:sz w:val="18"/>
+        </w:rPr>
+        <w:t>model/error_mae_rmse.png</w:t>
+      </w:r>
+      <w:r>
+        <w:rPr>
+          <w:rFonts w:ascii="Consolas" w:hAnsi="Consolas"/>
+          <w:sz w:val="18"/>
+          <w:rtl/>
+          <w:lang w:bidi="he-IL"/>
+        </w:rPr>
+        <w:br/>
+      </w:r>
+      <w:r>
+        <w:rPr>
+          <w:noProof/>
+        </w:rPr>
+        <w:drawing>
+          <wp:inline distT="0" distB="0" distL="0" distR="0" wp14:anchorId="25381FC0" wp14:editId="69EF6E86">
+            <wp:extent cx="5486400" cy="3181985"/>
+            <wp:effectExtent l="0" t="0" r="0" b="0"/>
+            <wp:docPr id="785405037" name="Picture 12"/>
+            <wp:cNvGraphicFramePr>
+              <a:graphicFrameLocks xmlns:a="http://schemas.openxmlformats.org/drawingml/2006/main" noChangeAspect="1"/>
+            </wp:cNvGraphicFramePr>
+            <a:graphic xmlns:a="http://schemas.openxmlformats.org/drawingml/2006/main">
+              <a:graphicData uri="http://schemas.openxmlformats.org/drawingml/2006/picture">
+                <pic:pic xmlns:pic="http://schemas.openxmlformats.org/drawingml/2006/picture">
+                  <pic:nvPicPr>
+                    <pic:cNvPr id="0" name="Picture 23"/>
+                    <pic:cNvPicPr>
+                      <a:picLocks noChangeAspect="1" noChangeArrowheads="1"/>
+                    </pic:cNvPicPr>
+                  </pic:nvPicPr>
+                  <pic:blipFill>
+                    <a:blip r:embed="rId17">
+                      <a:extLst>
+                        <a:ext uri="{28A0092B-C50C-407E-A947-70E740481C1C}">
+                          <a14:useLocalDpi xmlns:a14="http://schemas.microsoft.com/office/drawing/2010/main" val="0"/>
+                        </a:ext>
+                      </a:extLst>
+                    </a:blip>
+                    <a:srcRect/>
+                    <a:stretch>
+                      <a:fillRect/>
+                    </a:stretch>
+                  </pic:blipFill>
+                  <pic:spPr bwMode="auto">
+                    <a:xfrm>
+                      <a:off x="0" y="0"/>
+                      <a:ext cx="5486400" cy="3181985"/>
+                    </a:xfrm>
+                    <a:prstGeom prst="rect">
+                      <a:avLst/>
+                    </a:prstGeom>
+                    <a:noFill/>
+                    <a:ln>
+                      <a:noFill/>
+                    </a:ln>
+                  </pic:spPr>
+                </pic:pic>
+              </a:graphicData>
+            </a:graphic>
+          </wp:inline>
+        </w:drawing>
+      </w:r>
+    </w:p>
+    <w:p>
+      <w:r>
+        <w:rPr>
+          <w:b/>
+        </w:rPr>
+        <w:t xml:space="preserve">What it shows: </w:t>
+      </w:r>
+      <w:r>
+        <w:t>Grouped bars of mean absolute error and root mean squared error for each statistic, in that stat's own units.</w:t>
+      </w:r>
+    </w:p>
+    <w:p>
+      <w:r>
+        <w:rPr>
+          <w:b/>
+        </w:rPr>
+        <w:t xml:space="preserve">Insight to mention in the paper: </w:t>
+      </w:r>
+      <w:r>
+        <w:t>Absolute error is largest for points (MAE about 10.3) and very small for rate and low-count stats, simply because points are on a larger scale. RMSE sitting above MAE for every stat signals that a minority of players (typically those with role or injury changes) drive the biggest misses.</w:t>
+      </w:r>
+    </w:p>
+    <w:p>
+      <w:r>
+        <w:rPr>
+          <w:b/>
+        </w:rPr>
+        <w:t xml:space="preserve">Principles demonstrated: </w:t>
+      </w:r>
+      <w:r>
+        <w:rPr>
+          <w:i/>
+        </w:rPr>
+        <w:t>Scale (shared zero baseline), Perception (blue/orange grouped bars), Context.</w:t>
+      </w:r>
+    </w:p>
+    <w:p>
+      <w:pPr>
+        <w:pStyle w:val="Heading3"/>
+      </w:pPr>
+      <w:r>
+        <w:rPr>
+          <w:color w:val="0B5394"/>
+        </w:rPr>
+        <w:lastRenderedPageBreak/>
+        <w:t>4.3 Projection accuracy (Pearson / Spearman)</w:t>
+      </w:r>
+    </w:p>
+    <w:p>
+      <w:pPr>
+        <w:rPr>
+          <w:rFonts w:hint="cs"/>
+          <w:lang w:bidi="he-IL"/>
+        </w:rPr>
+      </w:pPr>
+      <w:r>
+        <w:rPr>
+          <w:b/>
+        </w:rPr>
+        <w:t xml:space="preserve">File: </w:t>
+      </w:r>
+      <w:r>
+        <w:rPr>
+          <w:rFonts w:ascii="Consolas" w:hAnsi="Consolas"/>
+          <w:sz w:val="18"/>
+        </w:rPr>
+        <w:t>model/correlation_pearson_spearman.png</w:t>
+      </w:r>
+      <w:r>
+        <w:rPr>
+          <w:rFonts w:ascii="Consolas" w:hAnsi="Consolas"/>
+          <w:sz w:val="18"/>
+          <w:rtl/>
+          <w:lang w:bidi="he-IL"/>
+        </w:rPr>
+        <w:br/>
+      </w:r>
+      <w:r>
+        <w:rPr>
+          <w:noProof/>
+        </w:rPr>
+        <w:drawing>
+          <wp:inline distT="0" distB="0" distL="0" distR="0" wp14:anchorId="549BBE62" wp14:editId="1B4C493F">
+            <wp:extent cx="5486400" cy="3181985"/>
+            <wp:effectExtent l="0" t="0" r="0" b="0"/>
+            <wp:docPr id="1338322721" name="Picture 13"/>
+            <wp:cNvGraphicFramePr>
+              <a:graphicFrameLocks xmlns:a="http://schemas.openxmlformats.org/drawingml/2006/main" noChangeAspect="1"/>
+            </wp:cNvGraphicFramePr>
+            <a:graphic xmlns:a="http://schemas.openxmlformats.org/drawingml/2006/main">
+              <a:graphicData uri="http://schemas.openxmlformats.org/drawingml/2006/picture">
+                <pic:pic xmlns:pic="http://schemas.openxmlformats.org/drawingml/2006/picture">
+                  <pic:nvPicPr>
+                    <pic:cNvPr id="0" name="Picture 25"/>
+                    <pic:cNvPicPr>
+                      <a:picLocks noChangeAspect="1" noChangeArrowheads="1"/>
+                    </pic:cNvPicPr>
+                  </pic:nvPicPr>
+                  <pic:blipFill>
+                    <a:blip r:embed="rId18">
+                      <a:extLst>
+                        <a:ext uri="{28A0092B-C50C-407E-A947-70E740481C1C}">
+                          <a14:useLocalDpi xmlns:a14="http://schemas.microsoft.com/office/drawing/2010/main" val="0"/>
+                        </a:ext>
+                      </a:extLst>
+                    </a:blip>
+                    <a:srcRect/>
+                    <a:stretch>
+                      <a:fillRect/>
+                    </a:stretch>
+                  </pic:blipFill>
+                  <pic:spPr bwMode="auto">
+                    <a:xfrm>
+                      <a:off x="0" y="0"/>
+                      <a:ext cx="5486400" cy="3181985"/>
+                    </a:xfrm>
+                    <a:prstGeom prst="rect">
+                      <a:avLst/>
+                    </a:prstGeom>
+                    <a:noFill/>
+                    <a:ln>
+                      <a:noFill/>
+                    </a:ln>
+                  </pic:spPr>
+                </pic:pic>
+              </a:graphicData>
+            </a:graphic>
+          </wp:inline>
+        </w:drawing>
+      </w:r>
+    </w:p>
+    <w:p>
+      <w:r>
+        <w:rPr>
+          <w:b/>
+        </w:rPr>
+        <w:t xml:space="preserve">What it shows: </w:t>
+      </w:r>
+      <w:r>
+        <w:t>Grouped bars of the Pearson and Spearman correlation between projected and actual values per stat (0-1 scale).</w:t>
+      </w:r>
+    </w:p>
+    <w:p>
+      <w:r>
+        <w:rPr>
+          <w:b/>
+        </w:rPr>
+        <w:t xml:space="preserve">Insight to mention in the paper: </w:t>
+      </w:r>
+      <w:r>
+        <w:t>Counting stats correlate strongly with reality (around 0.7-0.75) while percentage stats are much weaker (FG% and FT% near 0.37-0.43). Pearson and Spearman agreeing closely shows the ranking of players is preserved even where absolute values are noisy - important because H2H value depends on relative ordering.</w:t>
+      </w:r>
+    </w:p>
+    <w:p>
+      <w:r>
+        <w:rPr>
+          <w:b/>
+        </w:rPr>
+        <w:t xml:space="preserve">Principles demonstrated: </w:t>
+      </w:r>
+      <w:r>
+        <w:rPr>
+          <w:i/>
+        </w:rPr>
+        <w:t>Scale (0-1 axis), Perception, Context (two complementary metrics side by side).</w:t>
+      </w:r>
+    </w:p>
+    <w:p>
+      <w:pPr>
+        <w:pStyle w:val="Heading3"/>
+      </w:pPr>
+      <w:r>
+        <w:rPr>
+          <w:color w:val="0B5394"/>
+        </w:rPr>
+        <w:lastRenderedPageBreak/>
+        <w:t>4.4 Confidence-interval calibration</w:t>
+      </w:r>
+    </w:p>
+    <w:p>
+      <w:pPr>
+        <w:rPr>
+          <w:rFonts w:hint="cs"/>
+          <w:lang w:bidi="he-IL"/>
+        </w:rPr>
+      </w:pPr>
+      <w:r>
+        <w:rPr>
+          <w:b/>
+        </w:rPr>
+        <w:t xml:space="preserve">File: </w:t>
+      </w:r>
+      <w:r>
+        <w:rPr>
+          <w:rFonts w:ascii="Consolas" w:hAnsi="Consolas"/>
+          <w:sz w:val="18"/>
+        </w:rPr>
+        <w:t>model/ci_calibration.png</w:t>
+      </w:r>
+      <w:r>
+        <w:rPr>
+          <w:rFonts w:ascii="Consolas" w:hAnsi="Consolas"/>
+          <w:sz w:val="18"/>
+          <w:rtl/>
+          <w:lang w:bidi="he-IL"/>
+        </w:rPr>
+        <w:br/>
+      </w:r>
+      <w:r>
+        <w:rPr>
+          <w:noProof/>
+        </w:rPr>
+        <w:drawing>
+          <wp:inline distT="0" distB="0" distL="0" distR="0" wp14:anchorId="3F904035" wp14:editId="5A4EB46D">
+            <wp:extent cx="5486400" cy="3149600"/>
+            <wp:effectExtent l="0" t="0" r="0" b="0"/>
+            <wp:docPr id="1262792586" name="Picture 14"/>
+            <wp:cNvGraphicFramePr>
+              <a:graphicFrameLocks xmlns:a="http://schemas.openxmlformats.org/drawingml/2006/main" noChangeAspect="1"/>
+            </wp:cNvGraphicFramePr>
+            <a:graphic xmlns:a="http://schemas.openxmlformats.org/drawingml/2006/main">
+              <a:graphicData uri="http://schemas.openxmlformats.org/drawingml/2006/picture">
+                <pic:pic xmlns:pic="http://schemas.openxmlformats.org/drawingml/2006/picture">
+                  <pic:nvPicPr>
+                    <pic:cNvPr id="0" name="Picture 27"/>
+                    <pic:cNvPicPr>
+                      <a:picLocks noChangeAspect="1" noChangeArrowheads="1"/>
+                    </pic:cNvPicPr>
+                  </pic:nvPicPr>
+                  <pic:blipFill>
+                    <a:blip r:embed="rId19">
                       <a:extLst>
                         <a:ext uri="{28A0092B-C50C-407E-A947-70E740481C1C}">
                           <a14:useLocalDpi xmlns:a14="http://schemas.microsoft.com/office/drawing/2010/main" val="0"/>
@@ -1525,7 +2030,15 @@
         <w:t xml:space="preserve">What it shows: </w:t>
       </w:r>
       <w:r>
-        <w:t>Grouped bars of mean absolute error and root mean squared error for each statistic, in that stat's own units.</w:t>
+        <w:t xml:space="preserve">The share of actual outcomes that fell inside the predicted 5-95% interval per </w:t>
+      </w:r>
+      <w:proofErr w:type="gramStart"/>
+      <w:r>
+        <w:t>stat</w:t>
+      </w:r>
+      <w:proofErr w:type="gramEnd"/>
+      <w:r>
+        <w:t>, against the ideal 0.90 line.</w:t>
       </w:r>
     </w:p>
     <w:p>
@@ -1536,7 +2049,7 @@
         <w:t xml:space="preserve">Insight to mention in the paper: </w:t>
       </w:r>
       <w:r>
-        <w:t>Absolute error is largest for points (MAE about 10.3) and very small for rate and low-count stats, simply because points are on a larger scale. RMSE sitting above MAE for every stat signals that a minority of players (typically those with role or injury changes) drive the biggest misses.</w:t>
+        <w:t>Coverage averages only about 0.41 and is well below 0.90 for almost every counting stat, meaning the model's stated uncertainty is too narrow - real outcomes land outside the interval far more than 10% of the time. This is an honest limitation to report and a clear direction for future work (wider/recalibrated intervals).</w:t>
       </w:r>
     </w:p>
     <w:p>
@@ -1550,7 +2063,23 @@
         <w:rPr>
           <w:i/>
         </w:rPr>
-        <w:t>Scale (shared zero baseline), Perception (blue/orange grouped bars), Context.</w:t>
+        <w:t>Context (ideal-coverage reference line, honest reporting of a flaw), Scale.</w:t>
+      </w:r>
+    </w:p>
+    <w:p>
+      <w:pPr>
+        <w:pStyle w:val="Heading1"/>
+      </w:pPr>
+      <w:r>
+        <w:rPr>
+          <w:color w:val="0B5394"/>
+        </w:rPr>
+        <w:t>5. Draft-strategy comparison</w:t>
+      </w:r>
+    </w:p>
+    <w:p>
+      <w:r>
+        <w:t>The draft simulation answers the key strategic question of the project: which way of choosing players gives the best chance of winning the weekly category battles? Ten teams drafted from the same player pool, each following a different strategy (a balanced 'best-available' approach, or a focus such as guards or big men, or deliberately 'punting' - giving up - a category like turnovers, free-throw %, or points). A full head-to-head season was then simulated to see how each strategy performed.</w:t>
       </w:r>
     </w:p>
     <w:p>
@@ -1562,133 +2091,16 @@
           <w:color w:val="0B5394"/>
         </w:rPr>
         <w:lastRenderedPageBreak/>
-        <w:t>4.3 Projection accuracy (Pearson / Spearman)</w:t>
-      </w:r>
-    </w:p>
-    <w:p>
-      <w:r>
-        <w:rPr>
-          <w:b/>
-        </w:rPr>
-        <w:t xml:space="preserve">File: </w:t>
-      </w:r>
-      <w:r>
-        <w:rPr>
-          <w:rFonts w:ascii="Consolas" w:hAnsi="Consolas"/>
-          <w:sz w:val="18"/>
-        </w:rPr>
-        <w:t>model/correlation_pearson_spearman.png</w:t>
-      </w:r>
-      <w:r>
-        <w:rPr>
-          <w:rFonts w:ascii="Consolas" w:hAnsi="Consolas"/>
-          <w:sz w:val="18"/>
-        </w:rPr>
-        <w:br/>
-      </w:r>
-      <w:r>
-        <w:rPr>
-          <w:noProof/>
-        </w:rPr>
-        <w:drawing>
-          <wp:inline distT="0" distB="0" distL="0" distR="0" wp14:anchorId="0726C7D1" wp14:editId="189403DF">
-            <wp:extent cx="5486400" cy="3149600"/>
-            <wp:effectExtent l="0" t="0" r="0" b="0"/>
-            <wp:docPr id="411404577" name="Picture 12"/>
-            <wp:cNvGraphicFramePr>
-              <a:graphicFrameLocks xmlns:a="http://schemas.openxmlformats.org/drawingml/2006/main" noChangeAspect="1"/>
-            </wp:cNvGraphicFramePr>
-            <a:graphic xmlns:a="http://schemas.openxmlformats.org/drawingml/2006/main">
-              <a:graphicData uri="http://schemas.openxmlformats.org/drawingml/2006/picture">
-                <pic:pic xmlns:pic="http://schemas.openxmlformats.org/drawingml/2006/picture">
-                  <pic:nvPicPr>
-                    <pic:cNvPr id="0" name="Picture 23"/>
-                    <pic:cNvPicPr>
-                      <a:picLocks noChangeAspect="1" noChangeArrowheads="1"/>
-                    </pic:cNvPicPr>
-                  </pic:nvPicPr>
-                  <pic:blipFill>
-                    <a:blip r:embed="rId17">
-                      <a:extLst>
-                        <a:ext uri="{28A0092B-C50C-407E-A947-70E740481C1C}">
-                          <a14:useLocalDpi xmlns:a14="http://schemas.microsoft.com/office/drawing/2010/main" val="0"/>
-                        </a:ext>
-                      </a:extLst>
-                    </a:blip>
-                    <a:srcRect/>
-                    <a:stretch>
-                      <a:fillRect/>
-                    </a:stretch>
-                  </pic:blipFill>
-                  <pic:spPr bwMode="auto">
-                    <a:xfrm>
-                      <a:off x="0" y="0"/>
-                      <a:ext cx="5486400" cy="3149600"/>
-                    </a:xfrm>
-                    <a:prstGeom prst="rect">
-                      <a:avLst/>
-                    </a:prstGeom>
-                    <a:noFill/>
-                    <a:ln>
-                      <a:noFill/>
-                    </a:ln>
-                  </pic:spPr>
-                </pic:pic>
-              </a:graphicData>
-            </a:graphic>
-          </wp:inline>
-        </w:drawing>
-      </w:r>
-    </w:p>
-    <w:p>
-      <w:r>
-        <w:rPr>
-          <w:b/>
-        </w:rPr>
-        <w:t xml:space="preserve">What it shows: </w:t>
-      </w:r>
-      <w:r>
-        <w:t>Grouped bars of the Pearson and Spearman correlation between projected and actual values per stat (0-1 scale).</w:t>
-      </w:r>
-    </w:p>
-    <w:p>
-      <w:r>
-        <w:rPr>
-          <w:b/>
-        </w:rPr>
-        <w:t xml:space="preserve">Insight to mention in the paper: </w:t>
-      </w:r>
-      <w:r>
-        <w:t>Counting stats correlate strongly with reality (around 0.7-0.75) while percentage stats are much weaker (FG% and FT% near 0.37-0.43). Pearson and Spearman agreeing closely shows the ranking of players is preserved even where absolute values are noisy - important because H2H value depends on relative ordering.</w:t>
-      </w:r>
-    </w:p>
-    <w:p>
-      <w:r>
-        <w:rPr>
-          <w:b/>
-        </w:rPr>
-        <w:t xml:space="preserve">Principles demonstrated: </w:t>
-      </w:r>
-      <w:r>
-        <w:rPr>
-          <w:i/>
-        </w:rPr>
-        <w:t>Scale (0-1 axis), Perception, Context (two complementary metrics side by side).</w:t>
+        <w:t>5.1 Wins by draft strategy</w:t>
       </w:r>
     </w:p>
     <w:p>
       <w:pPr>
-        <w:pStyle w:val="Heading3"/>
+        <w:rPr>
+          <w:rFonts w:hint="cs"/>
+          <w:lang w:bidi="he-IL"/>
+        </w:rPr>
       </w:pPr>
-      <w:r>
-        <w:rPr>
-          <w:color w:val="0B5394"/>
-        </w:rPr>
-        <w:lastRenderedPageBreak/>
-        <w:t>4.4 Confidence-interval calibration</w:t>
-      </w:r>
-    </w:p>
-    <w:p>
       <w:r>
         <w:rPr>
           <w:b/>
@@ -1700,12 +2112,14 @@
           <w:rFonts w:ascii="Consolas" w:hAnsi="Consolas"/>
           <w:sz w:val="18"/>
         </w:rPr>
-        <w:t>model/ci_calibration.png</w:t>
+        <w:t>draft/standings_wins.png</w:t>
       </w:r>
       <w:r>
         <w:rPr>
           <w:rFonts w:ascii="Consolas" w:hAnsi="Consolas"/>
           <w:sz w:val="18"/>
+          <w:rtl/>
+          <w:lang w:bidi="he-IL"/>
         </w:rPr>
         <w:br/>
       </w:r>
@@ -1714,267 +2128,10 @@
           <w:noProof/>
         </w:rPr>
         <w:drawing>
-          <wp:inline distT="0" distB="0" distL="0" distR="0" wp14:anchorId="7821965B" wp14:editId="4DFE46D3">
-            <wp:extent cx="5486400" cy="3119755"/>
-            <wp:effectExtent l="0" t="0" r="0" b="4445"/>
-            <wp:docPr id="607454132" name="Picture 13"/>
-            <wp:cNvGraphicFramePr>
-              <a:graphicFrameLocks xmlns:a="http://schemas.openxmlformats.org/drawingml/2006/main" noChangeAspect="1"/>
-            </wp:cNvGraphicFramePr>
-            <a:graphic xmlns:a="http://schemas.openxmlformats.org/drawingml/2006/main">
-              <a:graphicData uri="http://schemas.openxmlformats.org/drawingml/2006/picture">
-                <pic:pic xmlns:pic="http://schemas.openxmlformats.org/drawingml/2006/picture">
-                  <pic:nvPicPr>
-                    <pic:cNvPr id="0" name="Picture 25"/>
-                    <pic:cNvPicPr>
-                      <a:picLocks noChangeAspect="1" noChangeArrowheads="1"/>
-                    </pic:cNvPicPr>
-                  </pic:nvPicPr>
-                  <pic:blipFill>
-                    <a:blip r:embed="rId18">
-                      <a:extLst>
-                        <a:ext uri="{28A0092B-C50C-407E-A947-70E740481C1C}">
-                          <a14:useLocalDpi xmlns:a14="http://schemas.microsoft.com/office/drawing/2010/main" val="0"/>
-                        </a:ext>
-                      </a:extLst>
-                    </a:blip>
-                    <a:srcRect/>
-                    <a:stretch>
-                      <a:fillRect/>
-                    </a:stretch>
-                  </pic:blipFill>
-                  <pic:spPr bwMode="auto">
-                    <a:xfrm>
-                      <a:off x="0" y="0"/>
-                      <a:ext cx="5486400" cy="3119755"/>
-                    </a:xfrm>
-                    <a:prstGeom prst="rect">
-                      <a:avLst/>
-                    </a:prstGeom>
-                    <a:noFill/>
-                    <a:ln>
-                      <a:noFill/>
-                    </a:ln>
-                  </pic:spPr>
-                </pic:pic>
-              </a:graphicData>
-            </a:graphic>
-          </wp:inline>
-        </w:drawing>
-      </w:r>
-    </w:p>
-    <w:p>
-      <w:r>
-        <w:rPr>
-          <w:b/>
-        </w:rPr>
-        <w:t xml:space="preserve">What it shows: </w:t>
-      </w:r>
-      <w:r>
-        <w:t>The share of actual outcomes that fell inside the predicted 5-95% interval per stat, against the ideal 0.90 line.</w:t>
-      </w:r>
-    </w:p>
-    <w:p>
-      <w:r>
-        <w:rPr>
-          <w:b/>
-        </w:rPr>
-        <w:t xml:space="preserve">Insight to mention in the paper: </w:t>
-      </w:r>
-      <w:r>
-        <w:t>Coverage averages only about 0.41 and is well below 0.90 for almost every counting stat, meaning the model's stated uncertainty is too narrow - real outcomes land outside the interval far more than 10% of the time. This is an honest limitation to report and a clear direction for future work (wider/recalibrated intervals).</w:t>
-      </w:r>
-    </w:p>
-    <w:p>
-      <w:r>
-        <w:rPr>
-          <w:b/>
-        </w:rPr>
-        <w:t xml:space="preserve">Principles demonstrated: </w:t>
-      </w:r>
-      <w:r>
-        <w:rPr>
-          <w:i/>
-        </w:rPr>
-        <w:t>Context (ideal-coverage reference line, honest reporting of a flaw), Scale.</w:t>
-      </w:r>
-    </w:p>
-    <w:p>
-      <w:pPr>
-        <w:pStyle w:val="Heading1"/>
-      </w:pPr>
-      <w:r>
-        <w:rPr>
-          <w:color w:val="0B5394"/>
-        </w:rPr>
-        <w:lastRenderedPageBreak/>
-        <w:t>5. Draft simulation</w:t>
-      </w:r>
-    </w:p>
-    <w:p>
-      <w:pPr>
-        <w:pStyle w:val="Heading3"/>
-      </w:pPr>
-      <w:r>
-        <w:rPr>
-          <w:color w:val="0B5394"/>
-        </w:rPr>
-        <w:t>5.1 Final standings</w:t>
-      </w:r>
-    </w:p>
-    <w:p>
-      <w:r>
-        <w:rPr>
-          <w:b/>
-        </w:rPr>
-        <w:t xml:space="preserve">File: </w:t>
-      </w:r>
-      <w:r>
-        <w:rPr>
-          <w:rFonts w:ascii="Consolas" w:hAnsi="Consolas"/>
-          <w:sz w:val="18"/>
-        </w:rPr>
-        <w:t>draft/standings_wins.png</w:t>
-      </w:r>
-      <w:r>
-        <w:rPr>
-          <w:rFonts w:ascii="Consolas" w:hAnsi="Consolas"/>
-          <w:sz w:val="18"/>
-        </w:rPr>
-        <w:br/>
-      </w:r>
-      <w:r>
-        <w:rPr>
-          <w:noProof/>
-        </w:rPr>
-        <w:drawing>
-          <wp:inline distT="0" distB="0" distL="0" distR="0" wp14:anchorId="75C05E6B" wp14:editId="734D76F7">
-            <wp:extent cx="5486400" cy="4334510"/>
-            <wp:effectExtent l="0" t="0" r="0" b="8890"/>
-            <wp:docPr id="1890091213" name="Picture 14"/>
-            <wp:cNvGraphicFramePr>
-              <a:graphicFrameLocks xmlns:a="http://schemas.openxmlformats.org/drawingml/2006/main" noChangeAspect="1"/>
-            </wp:cNvGraphicFramePr>
-            <a:graphic xmlns:a="http://schemas.openxmlformats.org/drawingml/2006/main">
-              <a:graphicData uri="http://schemas.openxmlformats.org/drawingml/2006/picture">
-                <pic:pic xmlns:pic="http://schemas.openxmlformats.org/drawingml/2006/picture">
-                  <pic:nvPicPr>
-                    <pic:cNvPr id="0" name="Picture 27"/>
-                    <pic:cNvPicPr>
-                      <a:picLocks noChangeAspect="1" noChangeArrowheads="1"/>
-                    </pic:cNvPicPr>
-                  </pic:nvPicPr>
-                  <pic:blipFill>
-                    <a:blip r:embed="rId19">
-                      <a:extLst>
-                        <a:ext uri="{28A0092B-C50C-407E-A947-70E740481C1C}">
-                          <a14:useLocalDpi xmlns:a14="http://schemas.microsoft.com/office/drawing/2010/main" val="0"/>
-                        </a:ext>
-                      </a:extLst>
-                    </a:blip>
-                    <a:srcRect/>
-                    <a:stretch>
-                      <a:fillRect/>
-                    </a:stretch>
-                  </pic:blipFill>
-                  <pic:spPr bwMode="auto">
-                    <a:xfrm>
-                      <a:off x="0" y="0"/>
-                      <a:ext cx="5486400" cy="4334510"/>
-                    </a:xfrm>
-                    <a:prstGeom prst="rect">
-                      <a:avLst/>
-                    </a:prstGeom>
-                    <a:noFill/>
-                    <a:ln>
-                      <a:noFill/>
-                    </a:ln>
-                  </pic:spPr>
-                </pic:pic>
-              </a:graphicData>
-            </a:graphic>
-          </wp:inline>
-        </w:drawing>
-      </w:r>
-    </w:p>
-    <w:p>
-      <w:r>
-        <w:rPr>
-          <w:b/>
-        </w:rPr>
-        <w:t xml:space="preserve">What it shows: </w:t>
-      </w:r>
-      <w:r>
-        <w:t>A horizontal bar chart of each simulated team's average weekly wins, annotated with total category points.</w:t>
-      </w:r>
-    </w:p>
-    <w:p>
-      <w:r>
-        <w:rPr>
-          <w:b/>
-        </w:rPr>
-        <w:t xml:space="preserve">Insight to mention in the paper: </w:t>
-      </w:r>
-      <w:r>
-        <w:t>The strategies produce a clear spread of 6.8 wins between best and worst: team 10 leads with 9.3 average weekly wins versus 2.6 for team 0. The gap shows that draft strategy materially affects outcomes, validating the simulation as a way to compare value approaches.</w:t>
-      </w:r>
-    </w:p>
-    <w:p>
-      <w:r>
-        <w:rPr>
-          <w:b/>
-        </w:rPr>
-        <w:t xml:space="preserve">Principles demonstrated: </w:t>
-      </w:r>
-      <w:r>
-        <w:rPr>
-          <w:i/>
-        </w:rPr>
-        <w:t>Scale (zero baseline, sorted), Perception (length encoding), Context (direct labels).</w:t>
-      </w:r>
-    </w:p>
-    <w:p>
-      <w:pPr>
-        <w:pStyle w:val="Heading3"/>
-      </w:pPr>
-      <w:r>
-        <w:rPr>
-          <w:color w:val="0B5394"/>
-        </w:rPr>
-        <w:lastRenderedPageBreak/>
-        <w:t>5.2 Team category strengths</w:t>
-      </w:r>
-    </w:p>
-    <w:p>
-      <w:r>
-        <w:rPr>
-          <w:b/>
-        </w:rPr>
-        <w:t xml:space="preserve">File: </w:t>
-      </w:r>
-      <w:r>
-        <w:rPr>
-          <w:rFonts w:ascii="Consolas" w:hAnsi="Consolas"/>
-          <w:sz w:val="18"/>
-        </w:rPr>
-        <w:t>draft/team_category_strengths.png</w:t>
-      </w:r>
-      <w:r>
-        <w:rPr>
-          <w:rFonts w:ascii="Consolas" w:hAnsi="Consolas"/>
-          <w:sz w:val="18"/>
-        </w:rPr>
-        <w:br/>
-      </w:r>
-      <w:r>
-        <w:rPr>
-          <w:noProof/>
-        </w:rPr>
-        <w:drawing>
-          <wp:inline distT="0" distB="0" distL="0" distR="0" wp14:anchorId="5217FFA5" wp14:editId="2A4E82F2">
-            <wp:extent cx="5486400" cy="4327525"/>
+          <wp:inline distT="0" distB="0" distL="0" distR="0" wp14:anchorId="1125592A" wp14:editId="48B8E86E">
+            <wp:extent cx="5486400" cy="4136390"/>
             <wp:effectExtent l="0" t="0" r="0" b="0"/>
-            <wp:docPr id="11923727" name="Picture 15"/>
+            <wp:docPr id="391304099" name="Picture 15"/>
             <wp:cNvGraphicFramePr>
               <a:graphicFrameLocks xmlns:a="http://schemas.openxmlformats.org/drawingml/2006/main" noChangeAspect="1"/>
             </wp:cNvGraphicFramePr>
@@ -2003,7 +2160,7 @@
                   <pic:spPr bwMode="auto">
                     <a:xfrm>
                       <a:off x="0" y="0"/>
-                      <a:ext cx="5486400" cy="4327525"/>
+                      <a:ext cx="5486400" cy="4136390"/>
                     </a:xfrm>
                     <a:prstGeom prst="rect">
                       <a:avLst/>
@@ -2028,7 +2185,7 @@
         <w:t xml:space="preserve">What it shows: </w:t>
       </w:r>
       <w:r>
-        <w:t>A heatmap of teams (ordered by standings) against the nine categories, colored by z-score within each category (turnovers sign-flipped so higher is always better).</w:t>
+        <w:t>A horizontal bar chart of the average weekly category-matchups won by each draft strategy over the simulated season.</w:t>
       </w:r>
     </w:p>
     <w:p>
@@ -2039,7 +2196,7 @@
         <w:t xml:space="preserve">Insight to mention in the paper: </w:t>
       </w:r>
       <w:r>
-        <w:t>Each team's row reveals the categories it punted or prioritized, and the top teams are not uniformly strong but specialized in a coherent set of categories. This visually confirms the H2H insight that building around a few targeted strengths beats chasing the best available player every round.</w:t>
+        <w:t>The best strategy is "Balanced (punt turnovers)" with 7.47 average weekly wins, closely followed by "Blocks-heavy" (7.14), while the weakest is "Big-man-focused (punt assists, 3-pointers made)" with only 1.27 - a spread of 6.2 wins between best and worst. The clear ordering shows that draft strategy materially changes the chance of winning: concentrating on scarce, high-impact categories (and punting a weak one like turnovers) outperforms over-specialized builds such as a big-man team that punts both assists and three-pointers.</w:t>
       </w:r>
     </w:p>
     <w:p>
@@ -2053,7 +2210,138 @@
         <w:rPr>
           <w:i/>
         </w:rPr>
-        <w:t>Transformation (z-score standardization, sign-flip for TOV), Perception (diverging colorblind-safe map), Context.</w:t>
+        <w:t>Scale (zero baseline, sorted), Perception (length encoding), Context (strategy labels and direct values).</w:t>
+      </w:r>
+    </w:p>
+    <w:p>
+      <w:pPr>
+        <w:pStyle w:val="Heading3"/>
+      </w:pPr>
+      <w:r>
+        <w:rPr>
+          <w:color w:val="0B5394"/>
+        </w:rPr>
+        <w:lastRenderedPageBreak/>
+        <w:t>5.2 Category strengths by strategy</w:t>
+      </w:r>
+    </w:p>
+    <w:p>
+      <w:pPr>
+        <w:rPr>
+          <w:rFonts w:hint="cs"/>
+          <w:lang w:bidi="he-IL"/>
+        </w:rPr>
+      </w:pPr>
+      <w:r>
+        <w:rPr>
+          <w:b/>
+        </w:rPr>
+        <w:t xml:space="preserve">File: </w:t>
+      </w:r>
+      <w:r>
+        <w:rPr>
+          <w:rFonts w:ascii="Consolas" w:hAnsi="Consolas"/>
+          <w:sz w:val="18"/>
+        </w:rPr>
+        <w:t>draft/team_category_strengths.png</w:t>
+      </w:r>
+      <w:r>
+        <w:rPr>
+          <w:rFonts w:ascii="Consolas" w:hAnsi="Consolas"/>
+          <w:sz w:val="18"/>
+          <w:rtl/>
+          <w:lang w:bidi="he-IL"/>
+        </w:rPr>
+        <w:br/>
+      </w:r>
+      <w:r>
+        <w:rPr>
+          <w:noProof/>
+        </w:rPr>
+        <w:drawing>
+          <wp:inline distT="0" distB="0" distL="0" distR="0" wp14:anchorId="4FE97A5C" wp14:editId="6C7EC268">
+            <wp:extent cx="5486400" cy="3923665"/>
+            <wp:effectExtent l="0" t="0" r="0" b="635"/>
+            <wp:docPr id="113543978" name="Picture 16"/>
+            <wp:cNvGraphicFramePr>
+              <a:graphicFrameLocks xmlns:a="http://schemas.openxmlformats.org/drawingml/2006/main" noChangeAspect="1"/>
+            </wp:cNvGraphicFramePr>
+            <a:graphic xmlns:a="http://schemas.openxmlformats.org/drawingml/2006/main">
+              <a:graphicData uri="http://schemas.openxmlformats.org/drawingml/2006/picture">
+                <pic:pic xmlns:pic="http://schemas.openxmlformats.org/drawingml/2006/picture">
+                  <pic:nvPicPr>
+                    <pic:cNvPr id="0" name="Picture 31"/>
+                    <pic:cNvPicPr>
+                      <a:picLocks noChangeAspect="1" noChangeArrowheads="1"/>
+                    </pic:cNvPicPr>
+                  </pic:nvPicPr>
+                  <pic:blipFill>
+                    <a:blip r:embed="rId21">
+                      <a:extLst>
+                        <a:ext uri="{28A0092B-C50C-407E-A947-70E740481C1C}">
+                          <a14:useLocalDpi xmlns:a14="http://schemas.microsoft.com/office/drawing/2010/main" val="0"/>
+                        </a:ext>
+                      </a:extLst>
+                    </a:blip>
+                    <a:srcRect/>
+                    <a:stretch>
+                      <a:fillRect/>
+                    </a:stretch>
+                  </pic:blipFill>
+                  <pic:spPr bwMode="auto">
+                    <a:xfrm>
+                      <a:off x="0" y="0"/>
+                      <a:ext cx="5486400" cy="3923665"/>
+                    </a:xfrm>
+                    <a:prstGeom prst="rect">
+                      <a:avLst/>
+                    </a:prstGeom>
+                    <a:noFill/>
+                    <a:ln>
+                      <a:noFill/>
+                    </a:ln>
+                  </pic:spPr>
+                </pic:pic>
+              </a:graphicData>
+            </a:graphic>
+          </wp:inline>
+        </w:drawing>
+      </w:r>
+    </w:p>
+    <w:p>
+      <w:r>
+        <w:rPr>
+          <w:b/>
+        </w:rPr>
+        <w:t xml:space="preserve">What it shows: </w:t>
+      </w:r>
+      <w:r>
+        <w:t>A heatmap of each draft strategy (rows, ordered best-to-worst) against the nine categories, colored by z-score within each category (red = above league average, blue = below; turnovers sign-flipped so red is always better).</w:t>
+      </w:r>
+    </w:p>
+    <w:p>
+      <w:r>
+        <w:rPr>
+          <w:b/>
+        </w:rPr>
+        <w:t xml:space="preserve">Insight to mention in the paper: </w:t>
+      </w:r>
+      <w:r>
+        <w:t>Each row shows the fingerprint of a strategy: punt strategies are deep blue in the category they gave up but red across the rest, and the top-ranked strategies are strong in several scarce categories at once rather than dominating only one. This visually explains why the winning strategy won - it converted its draft focus into real category advantages - and confirms the H2H principle that building around a coherent set of targeted strengths beats simply drafting the best available player every round.</w:t>
+      </w:r>
+    </w:p>
+    <w:p>
+      <w:r>
+        <w:rPr>
+          <w:b/>
+        </w:rPr>
+        <w:t xml:space="preserve">Principles demonstrated: </w:t>
+      </w:r>
+      <w:r>
+        <w:rPr>
+          <w:i/>
+        </w:rPr>
+        <w:t>Transformation (z-score standardization, sign-flip for TOV), Perception (warm/cold diverging map), Context.</w:t>
       </w:r>
     </w:p>
     <w:sectPr>
@@ -2239,31 +2527,31 @@
       </w:rPr>
     </w:lvl>
   </w:abstractNum>
-  <w:num w:numId="1" w16cid:durableId="1895967421">
+  <w:num w:numId="1" w16cid:durableId="670908170">
     <w:abstractNumId w:val="8"/>
   </w:num>
-  <w:num w:numId="2" w16cid:durableId="1122766554">
+  <w:num w:numId="2" w16cid:durableId="56587976">
     <w:abstractNumId w:val="6"/>
   </w:num>
-  <w:num w:numId="3" w16cid:durableId="1291474735">
+  <w:num w:numId="3" w16cid:durableId="1885366254">
     <w:abstractNumId w:val="5"/>
   </w:num>
-  <w:num w:numId="4" w16cid:durableId="2034066476">
+  <w:num w:numId="4" w16cid:durableId="510415531">
     <w:abstractNumId w:val="4"/>
   </w:num>
-  <w:num w:numId="5" w16cid:durableId="113524398">
+  <w:num w:numId="5" w16cid:durableId="1910573005">
     <w:abstractNumId w:val="7"/>
   </w:num>
-  <w:num w:numId="6" w16cid:durableId="49119109">
+  <w:num w:numId="6" w16cid:durableId="619528168">
     <w:abstractNumId w:val="3"/>
   </w:num>
-  <w:num w:numId="7" w16cid:durableId="1669363177">
+  <w:num w:numId="7" w16cid:durableId="630793888">
     <w:abstractNumId w:val="2"/>
   </w:num>
-  <w:num w:numId="8" w16cid:durableId="454953604">
+  <w:num w:numId="8" w16cid:durableId="148862961">
     <w:abstractNumId w:val="1"/>
   </w:num>
-  <w:num w:numId="9" w16cid:durableId="346181948">
+  <w:num w:numId="9" w16cid:durableId="1613128201">
     <w:abstractNumId w:val="0"/>
   </w:num>
 </w:numbering>

</xml_diff>